<commit_message>
Actualización documento con contenido
</commit_message>
<xml_diff>
--- a/Documentacion/Insumo_jira.docx
+++ b/Documentacion/Insumo_jira.docx
@@ -14,6 +14,94 @@
         </w:rPr>
         <w:t xml:space="preserve"> Insumo_jira.docx</w:t>
       </w:r>
+    </w:p>
+    <w:p>
+      <w:r>
+        <w:rPr>
+          <w:b/>
+          <w:bCs/>
+        </w:rPr>
+        <w:t>Título:</w:t>
+      </w:r>
+      <w:r>
+        <w:br/>
+        <w:t>Proyecto Inventario de Joyería</w:t>
+      </w:r>
+    </w:p>
+    <w:p>
+      <w:r>
+        <w:rPr>
+          <w:b/>
+          <w:bCs/>
+        </w:rPr>
+        <w:t>Descripción:</w:t>
+      </w:r>
+      <w:r>
+        <w:br/>
+        <w:t>Este proyecto tiene como objetivo gestionar el inventario de una joyería, permitiendo organizar productos, controlar existencias y facilitar la administración de los artículos.</w:t>
+      </w:r>
+    </w:p>
+    <w:p>
+      <w:r>
+        <w:rPr>
+          <w:b/>
+          <w:bCs/>
+        </w:rPr>
+        <w:t>Uso de Jira:</w:t>
+      </w:r>
+      <w:r>
+        <w:br/>
+        <w:t>Se utilizó Jira para la creación de historias de usuario y subtareas, permitiendo organizar las actividades del proyecto y hacer seguimiento al avance.</w:t>
+      </w:r>
+    </w:p>
+    <w:p>
+      <w:r>
+        <w:rPr>
+          <w:b/>
+          <w:bCs/>
+        </w:rPr>
+        <w:t>Uso de Git:</w:t>
+      </w:r>
+      <w:r>
+        <w:br/>
+        <w:t xml:space="preserve">Se utilizó Git como sistema de control de versiones para registrar los cambios realizados en el proyecto mediante </w:t>
+      </w:r>
+      <w:proofErr w:type="spellStart"/>
+      <w:r>
+        <w:t>commits</w:t>
+      </w:r>
+      <w:proofErr w:type="spellEnd"/>
+      <w:r>
+        <w:t>.</w:t>
+      </w:r>
+    </w:p>
+    <w:p>
+      <w:r>
+        <w:rPr>
+          <w:b/>
+          <w:bCs/>
+        </w:rPr>
+        <w:t>Uso de GitHub:</w:t>
+      </w:r>
+      <w:r>
+        <w:br/>
+        <w:t xml:space="preserve">Se utilizó GitHub como repositorio remoto para almacenar el proyecto, permitiendo visualizar los archivos y gestionar las ramas como </w:t>
+      </w:r>
+      <w:proofErr w:type="spellStart"/>
+      <w:r>
+        <w:t>develop</w:t>
+      </w:r>
+      <w:proofErr w:type="spellEnd"/>
+      <w:r>
+        <w:t>.</w:t>
+      </w:r>
+    </w:p>
+    <w:p>
+      <w:pPr>
+        <w:rPr>
+          <w:lang w:val="es-MX"/>
+        </w:rPr>
+      </w:pPr>
     </w:p>
     <w:sectPr>
       <w:pgSz w:w="12240" w:h="15840"/>
@@ -628,7 +716,6 @@
   <w:style w:type="character" w:default="1" w:styleId="Fuentedeprrafopredeter">
     <w:name w:val="Default Paragraph Font"/>
     <w:uiPriority w:val="1"/>
-    <w:semiHidden/>
     <w:unhideWhenUsed/>
   </w:style>
   <w:style w:type="table" w:default="1" w:styleId="Tablanormal">

</xml_diff>